<commit_message>
Completar portada del plan de proyecto con docente y asignatura
Co-Authored-By: Claude Opus 5.5 (1M context) <noreply@anthropic.com>
</commit_message>
<xml_diff>
--- a/docs/planificacion/Plan-de-proyecto-QuienLoTiene.docx
+++ b/docs/planificacion/Plan-de-proyecto-QuienLoTiene.docx
@@ -12,7 +12,7 @@
           <w:noProof/>
         </w:rPr>
         <w:drawing>
-          <wp:inline distT="0" distB="0" distL="0" distR="0" wp14:anchorId="01D4807A" wp14:editId="50518982">
+          <wp:inline distT="0" distB="0" distL="0" distR="0" wp14:anchorId="729D24DA" wp14:editId="119BC4F2">
             <wp:extent cx="1737360" cy="1737360"/>
             <wp:effectExtent l="0" t="0" r="0" b="0"/>
             <wp:docPr id="1" name="Picture 1"/>
@@ -178,7 +178,7 @@
         <w:jc w:val="center"/>
       </w:pPr>
       <w:r>
-        <w:t>Ingeniería del Software III</w:t>
+        <w:t>Ingeniería de Software III</w:t>
       </w:r>
     </w:p>
     <w:p>
@@ -187,7 +187,7 @@
         <w:jc w:val="center"/>
       </w:pPr>
       <w:r>
-        <w:t>Docente: [Nombre del docente]</w:t>
+        <w:t>Docente: Andres Felipe Arboleda</w:t>
       </w:r>
     </w:p>
     <w:p>
@@ -242,7 +242,7 @@
       <w:r>
         <w:fldChar w:fldCharType="separate"/>
       </w:r>
-      <w:hyperlink w:anchor="_Toc244115677" w:history="1">
+      <w:hyperlink w:anchor="_Toc244116210" w:history="1">
         <w:r>
           <w:rPr>
             <w:rStyle w:val="Hipervnculo"/>
@@ -269,7 +269,7 @@
             <w:noProof/>
             <w:webHidden/>
           </w:rPr>
-          <w:instrText xml:space="preserve"> PAGEREF _Toc244115677 \h </w:instrText>
+          <w:instrText xml:space="preserve"> PAGEREF _Toc244116210 \h </w:instrText>
         </w:r>
         <w:r>
           <w:rPr>
@@ -316,7 +316,7 @@
           <w14:ligatures w14:val="standardContextual"/>
         </w:rPr>
       </w:pPr>
-      <w:hyperlink w:anchor="_Toc244115678" w:history="1">
+      <w:hyperlink w:anchor="_Toc244116211" w:history="1">
         <w:r>
           <w:rPr>
             <w:rStyle w:val="Hipervnculo"/>
@@ -343,7 +343,7 @@
             <w:noProof/>
             <w:webHidden/>
           </w:rPr>
-          <w:instrText xml:space="preserve"> PAGEREF _Toc244115678 \h </w:instrText>
+          <w:instrText xml:space="preserve"> PAGEREF _Toc244116211 \h </w:instrText>
         </w:r>
         <w:r>
           <w:rPr>
@@ -390,7 +390,7 @@
           <w14:ligatures w14:val="standardContextual"/>
         </w:rPr>
       </w:pPr>
-      <w:hyperlink w:anchor="_Toc244115679" w:history="1">
+      <w:hyperlink w:anchor="_Toc244116212" w:history="1">
         <w:r>
           <w:rPr>
             <w:rStyle w:val="Hipervnculo"/>
@@ -417,7 +417,7 @@
             <w:noProof/>
             <w:webHidden/>
           </w:rPr>
-          <w:instrText xml:space="preserve"> PAGEREF _Toc244115679 \h </w:instrText>
+          <w:instrText xml:space="preserve"> PAGEREF _Toc244116212 \h </w:instrText>
         </w:r>
         <w:r>
           <w:rPr>
@@ -464,7 +464,7 @@
           <w14:ligatures w14:val="standardContextual"/>
         </w:rPr>
       </w:pPr>
-      <w:hyperlink w:anchor="_Toc244115680" w:history="1">
+      <w:hyperlink w:anchor="_Toc244116213" w:history="1">
         <w:r>
           <w:rPr>
             <w:rStyle w:val="Hipervnculo"/>
@@ -491,7 +491,7 @@
             <w:noProof/>
             <w:webHidden/>
           </w:rPr>
-          <w:instrText xml:space="preserve"> PAGEREF _Toc244115680 \h </w:instrText>
+          <w:instrText xml:space="preserve"> PAGEREF _Toc244116213 \h </w:instrText>
         </w:r>
         <w:r>
           <w:rPr>
@@ -538,7 +538,7 @@
           <w14:ligatures w14:val="standardContextual"/>
         </w:rPr>
       </w:pPr>
-      <w:hyperlink w:anchor="_Toc244115681" w:history="1">
+      <w:hyperlink w:anchor="_Toc244116214" w:history="1">
         <w:r>
           <w:rPr>
             <w:rStyle w:val="Hipervnculo"/>
@@ -565,7 +565,7 @@
             <w:noProof/>
             <w:webHidden/>
           </w:rPr>
-          <w:instrText xml:space="preserve"> PAGEREF _Toc244115681 \h </w:instrText>
+          <w:instrText xml:space="preserve"> PAGEREF _Toc244116214 \h </w:instrText>
         </w:r>
         <w:r>
           <w:rPr>
@@ -612,7 +612,7 @@
           <w14:ligatures w14:val="standardContextual"/>
         </w:rPr>
       </w:pPr>
-      <w:hyperlink w:anchor="_Toc244115682" w:history="1">
+      <w:hyperlink w:anchor="_Toc244116215" w:history="1">
         <w:r>
           <w:rPr>
             <w:rStyle w:val="Hipervnculo"/>
@@ -639,7 +639,7 @@
             <w:noProof/>
             <w:webHidden/>
           </w:rPr>
-          <w:instrText xml:space="preserve"> PAGEREF _Toc244115682 \h </w:instrText>
+          <w:instrText xml:space="preserve"> PAGEREF _Toc244116215 \h </w:instrText>
         </w:r>
         <w:r>
           <w:rPr>
@@ -686,7 +686,7 @@
           <w14:ligatures w14:val="standardContextual"/>
         </w:rPr>
       </w:pPr>
-      <w:hyperlink w:anchor="_Toc244115683" w:history="1">
+      <w:hyperlink w:anchor="_Toc244116216" w:history="1">
         <w:r>
           <w:rPr>
             <w:rStyle w:val="Hipervnculo"/>
@@ -713,7 +713,7 @@
             <w:noProof/>
             <w:webHidden/>
           </w:rPr>
-          <w:instrText xml:space="preserve"> PAGEREF _Toc244115683 \h </w:instrText>
+          <w:instrText xml:space="preserve"> PAGEREF _Toc244116216 \h </w:instrText>
         </w:r>
         <w:r>
           <w:rPr>
@@ -760,7 +760,7 @@
           <w14:ligatures w14:val="standardContextual"/>
         </w:rPr>
       </w:pPr>
-      <w:hyperlink w:anchor="_Toc244115684" w:history="1">
+      <w:hyperlink w:anchor="_Toc244116217" w:history="1">
         <w:r>
           <w:rPr>
             <w:rStyle w:val="Hipervnculo"/>
@@ -787,7 +787,7 @@
             <w:noProof/>
             <w:webHidden/>
           </w:rPr>
-          <w:instrText xml:space="preserve"> PAGEREF _Toc244115684 \h </w:instrText>
+          <w:instrText xml:space="preserve"> PAGEREF _Toc244116217 \h </w:instrText>
         </w:r>
         <w:r>
           <w:rPr>
@@ -834,7 +834,7 @@
           <w14:ligatures w14:val="standardContextual"/>
         </w:rPr>
       </w:pPr>
-      <w:hyperlink w:anchor="_Toc244115685" w:history="1">
+      <w:hyperlink w:anchor="_Toc244116218" w:history="1">
         <w:r>
           <w:rPr>
             <w:rStyle w:val="Hipervnculo"/>
@@ -861,7 +861,7 @@
             <w:noProof/>
             <w:webHidden/>
           </w:rPr>
-          <w:instrText xml:space="preserve"> PAGEREF _Toc244115685 \h </w:instrText>
+          <w:instrText xml:space="preserve"> PAGEREF _Toc244116218 \h </w:instrText>
         </w:r>
         <w:r>
           <w:rPr>
@@ -908,7 +908,7 @@
           <w14:ligatures w14:val="standardContextual"/>
         </w:rPr>
       </w:pPr>
-      <w:hyperlink w:anchor="_Toc244115686" w:history="1">
+      <w:hyperlink w:anchor="_Toc244116219" w:history="1">
         <w:r>
           <w:rPr>
             <w:rStyle w:val="Hipervnculo"/>
@@ -935,7 +935,7 @@
             <w:noProof/>
             <w:webHidden/>
           </w:rPr>
-          <w:instrText xml:space="preserve"> PAGEREF _Toc244115686 \h </w:instrText>
+          <w:instrText xml:space="preserve"> PAGEREF _Toc244116219 \h </w:instrText>
         </w:r>
         <w:r>
           <w:rPr>
@@ -982,7 +982,7 @@
           <w14:ligatures w14:val="standardContextual"/>
         </w:rPr>
       </w:pPr>
-      <w:hyperlink w:anchor="_Toc244115687" w:history="1">
+      <w:hyperlink w:anchor="_Toc244116220" w:history="1">
         <w:r>
           <w:rPr>
             <w:rStyle w:val="Hipervnculo"/>
@@ -1009,7 +1009,7 @@
             <w:noProof/>
             <w:webHidden/>
           </w:rPr>
-          <w:instrText xml:space="preserve"> PAGEREF _Toc244115687 \h </w:instrText>
+          <w:instrText xml:space="preserve"> PAGEREF _Toc244116220 \h </w:instrText>
         </w:r>
         <w:r>
           <w:rPr>
@@ -1056,7 +1056,7 @@
           <w14:ligatures w14:val="standardContextual"/>
         </w:rPr>
       </w:pPr>
-      <w:hyperlink w:anchor="_Toc244115688" w:history="1">
+      <w:hyperlink w:anchor="_Toc244116221" w:history="1">
         <w:r>
           <w:rPr>
             <w:rStyle w:val="Hipervnculo"/>
@@ -1083,7 +1083,7 @@
             <w:noProof/>
             <w:webHidden/>
           </w:rPr>
-          <w:instrText xml:space="preserve"> PAGEREF _Toc244115688 \h </w:instrText>
+          <w:instrText xml:space="preserve"> PAGEREF _Toc244116221 \h </w:instrText>
         </w:r>
         <w:r>
           <w:rPr>
@@ -1130,7 +1130,7 @@
           <w14:ligatures w14:val="standardContextual"/>
         </w:rPr>
       </w:pPr>
-      <w:hyperlink w:anchor="_Toc244115689" w:history="1">
+      <w:hyperlink w:anchor="_Toc244116222" w:history="1">
         <w:r>
           <w:rPr>
             <w:rStyle w:val="Hipervnculo"/>
@@ -1157,7 +1157,7 @@
             <w:noProof/>
             <w:webHidden/>
           </w:rPr>
-          <w:instrText xml:space="preserve"> PAGEREF _Toc244115689 \h </w:instrText>
+          <w:instrText xml:space="preserve"> PAGEREF _Toc244116222 \h </w:instrText>
         </w:r>
         <w:r>
           <w:rPr>
@@ -1204,7 +1204,7 @@
           <w14:ligatures w14:val="standardContextual"/>
         </w:rPr>
       </w:pPr>
-      <w:hyperlink w:anchor="_Toc244115690" w:history="1">
+      <w:hyperlink w:anchor="_Toc244116223" w:history="1">
         <w:r>
           <w:rPr>
             <w:rStyle w:val="Hipervnculo"/>
@@ -1231,7 +1231,7 @@
             <w:noProof/>
             <w:webHidden/>
           </w:rPr>
-          <w:instrText xml:space="preserve"> PAGEREF _Toc244115690 \h </w:instrText>
+          <w:instrText xml:space="preserve"> PAGEREF _Toc244116223 \h </w:instrText>
         </w:r>
         <w:r>
           <w:rPr>
@@ -1278,7 +1278,7 @@
           <w14:ligatures w14:val="standardContextual"/>
         </w:rPr>
       </w:pPr>
-      <w:hyperlink w:anchor="_Toc244115691" w:history="1">
+      <w:hyperlink w:anchor="_Toc244116224" w:history="1">
         <w:r>
           <w:rPr>
             <w:rStyle w:val="Hipervnculo"/>
@@ -1305,7 +1305,7 @@
             <w:noProof/>
             <w:webHidden/>
           </w:rPr>
-          <w:instrText xml:space="preserve"> PAGEREF _Toc244115691 \h </w:instrText>
+          <w:instrText xml:space="preserve"> PAGEREF _Toc244116224 \h </w:instrText>
         </w:r>
         <w:r>
           <w:rPr>
@@ -1352,7 +1352,7 @@
           <w14:ligatures w14:val="standardContextual"/>
         </w:rPr>
       </w:pPr>
-      <w:hyperlink w:anchor="_Toc244115692" w:history="1">
+      <w:hyperlink w:anchor="_Toc244116225" w:history="1">
         <w:r>
           <w:rPr>
             <w:rStyle w:val="Hipervnculo"/>
@@ -1379,7 +1379,7 @@
             <w:noProof/>
             <w:webHidden/>
           </w:rPr>
-          <w:instrText xml:space="preserve"> PAGEREF _Toc244115692 \h </w:instrText>
+          <w:instrText xml:space="preserve"> PAGEREF _Toc244116225 \h </w:instrText>
         </w:r>
         <w:r>
           <w:rPr>
@@ -1426,7 +1426,7 @@
           <w14:ligatures w14:val="standardContextual"/>
         </w:rPr>
       </w:pPr>
-      <w:hyperlink w:anchor="_Toc244115693" w:history="1">
+      <w:hyperlink w:anchor="_Toc244116226" w:history="1">
         <w:r>
           <w:rPr>
             <w:rStyle w:val="Hipervnculo"/>
@@ -1453,7 +1453,7 @@
             <w:noProof/>
             <w:webHidden/>
           </w:rPr>
-          <w:instrText xml:space="preserve"> PAGEREF _Toc244115693 \h </w:instrText>
+          <w:instrText xml:space="preserve"> PAGEREF _Toc244116226 \h </w:instrText>
         </w:r>
         <w:r>
           <w:rPr>
@@ -1500,7 +1500,7 @@
           <w14:ligatures w14:val="standardContextual"/>
         </w:rPr>
       </w:pPr>
-      <w:hyperlink w:anchor="_Toc244115694" w:history="1">
+      <w:hyperlink w:anchor="_Toc244116227" w:history="1">
         <w:r>
           <w:rPr>
             <w:rStyle w:val="Hipervnculo"/>
@@ -1527,7 +1527,7 @@
             <w:noProof/>
             <w:webHidden/>
           </w:rPr>
-          <w:instrText xml:space="preserve"> PAGEREF _Toc244115694 \h </w:instrText>
+          <w:instrText xml:space="preserve"> PAGEREF _Toc244116227 \h </w:instrText>
         </w:r>
         <w:r>
           <w:rPr>
@@ -1574,7 +1574,7 @@
           <w14:ligatures w14:val="standardContextual"/>
         </w:rPr>
       </w:pPr>
-      <w:hyperlink w:anchor="_Toc244115695" w:history="1">
+      <w:hyperlink w:anchor="_Toc244116228" w:history="1">
         <w:r>
           <w:rPr>
             <w:rStyle w:val="Hipervnculo"/>
@@ -1601,7 +1601,7 @@
             <w:noProof/>
             <w:webHidden/>
           </w:rPr>
-          <w:instrText xml:space="preserve"> PAGEREF _Toc244115695 \h </w:instrText>
+          <w:instrText xml:space="preserve"> PAGEREF _Toc244116228 \h </w:instrText>
         </w:r>
         <w:r>
           <w:rPr>
@@ -1648,7 +1648,7 @@
           <w14:ligatures w14:val="standardContextual"/>
         </w:rPr>
       </w:pPr>
-      <w:hyperlink w:anchor="_Toc244115696" w:history="1">
+      <w:hyperlink w:anchor="_Toc244116229" w:history="1">
         <w:r>
           <w:rPr>
             <w:rStyle w:val="Hipervnculo"/>
@@ -1675,7 +1675,7 @@
             <w:noProof/>
             <w:webHidden/>
           </w:rPr>
-          <w:instrText xml:space="preserve"> PAGEREF _Toc244115696 \h </w:instrText>
+          <w:instrText xml:space="preserve"> PAGEREF _Toc244116229 \h </w:instrText>
         </w:r>
         <w:r>
           <w:rPr>
@@ -1722,7 +1722,7 @@
           <w14:ligatures w14:val="standardContextual"/>
         </w:rPr>
       </w:pPr>
-      <w:hyperlink w:anchor="_Toc244115697" w:history="1">
+      <w:hyperlink w:anchor="_Toc244116230" w:history="1">
         <w:r>
           <w:rPr>
             <w:rStyle w:val="Hipervnculo"/>
@@ -1749,7 +1749,7 @@
             <w:noProof/>
             <w:webHidden/>
           </w:rPr>
-          <w:instrText xml:space="preserve"> PAGEREF _Toc244115697 \h </w:instrText>
+          <w:instrText xml:space="preserve"> PAGEREF _Toc244116230 \h </w:instrText>
         </w:r>
         <w:r>
           <w:rPr>
@@ -1796,7 +1796,7 @@
           <w14:ligatures w14:val="standardContextual"/>
         </w:rPr>
       </w:pPr>
-      <w:hyperlink w:anchor="_Toc244115698" w:history="1">
+      <w:hyperlink w:anchor="_Toc244116231" w:history="1">
         <w:r>
           <w:rPr>
             <w:rStyle w:val="Hipervnculo"/>
@@ -1823,7 +1823,7 @@
             <w:noProof/>
             <w:webHidden/>
           </w:rPr>
-          <w:instrText xml:space="preserve"> PAGEREF _Toc244115698 \h </w:instrText>
+          <w:instrText xml:space="preserve"> PAGEREF _Toc244116231 \h </w:instrText>
         </w:r>
         <w:r>
           <w:rPr>
@@ -1870,7 +1870,7 @@
           <w14:ligatures w14:val="standardContextual"/>
         </w:rPr>
       </w:pPr>
-      <w:hyperlink w:anchor="_Toc244115699" w:history="1">
+      <w:hyperlink w:anchor="_Toc244116232" w:history="1">
         <w:r>
           <w:rPr>
             <w:rStyle w:val="Hipervnculo"/>
@@ -1897,7 +1897,7 @@
             <w:noProof/>
             <w:webHidden/>
           </w:rPr>
-          <w:instrText xml:space="preserve"> PAGEREF _Toc244115699 \h </w:instrText>
+          <w:instrText xml:space="preserve"> PAGEREF _Toc244116232 \h </w:instrText>
         </w:r>
         <w:r>
           <w:rPr>
@@ -1944,7 +1944,7 @@
           <w14:ligatures w14:val="standardContextual"/>
         </w:rPr>
       </w:pPr>
-      <w:hyperlink w:anchor="_Toc244115700" w:history="1">
+      <w:hyperlink w:anchor="_Toc244116233" w:history="1">
         <w:r>
           <w:rPr>
             <w:rStyle w:val="Hipervnculo"/>
@@ -1971,7 +1971,7 @@
             <w:noProof/>
             <w:webHidden/>
           </w:rPr>
-          <w:instrText xml:space="preserve"> PAGEREF _Toc244115700 \h </w:instrText>
+          <w:instrText xml:space="preserve"> PAGEREF _Toc244116233 \h </w:instrText>
         </w:r>
         <w:r>
           <w:rPr>
@@ -2019,7 +2019,7 @@
       <w:pPr>
         <w:pStyle w:val="Ttulo1"/>
       </w:pPr>
-      <w:bookmarkStart w:id="0" w:name="_Toc244115677"/>
+      <w:bookmarkStart w:id="0" w:name="_Toc244116210"/>
       <w:r>
         <w:lastRenderedPageBreak/>
         <w:t>Introducción</w:t>
@@ -2048,7 +2048,7 @@
       <w:pPr>
         <w:pStyle w:val="Ttulo2"/>
       </w:pPr>
-      <w:bookmarkStart w:id="1" w:name="_Toc244115678"/>
+      <w:bookmarkStart w:id="1" w:name="_Toc244116211"/>
       <w:r>
         <w:lastRenderedPageBreak/>
         <w:t>Objetivos</w:t>
@@ -2112,7 +2112,7 @@
       <w:pPr>
         <w:pStyle w:val="Ttulo1"/>
       </w:pPr>
-      <w:bookmarkStart w:id="2" w:name="_Toc244115679"/>
+      <w:bookmarkStart w:id="2" w:name="_Toc244116212"/>
       <w:r>
         <w:t>Ciclo de vida del software</w:t>
       </w:r>
@@ -2127,7 +2127,7 @@
       <w:pPr>
         <w:pStyle w:val="Ttulo2"/>
       </w:pPr>
-      <w:bookmarkStart w:id="3" w:name="_Toc244115680"/>
+      <w:bookmarkStart w:id="3" w:name="_Toc244116213"/>
       <w:r>
         <w:t>Criterios de selección</w:t>
       </w:r>
@@ -4429,7 +4429,7 @@
       <w:pPr>
         <w:pStyle w:val="Ttulo2"/>
       </w:pPr>
-      <w:bookmarkStart w:id="4" w:name="_Toc244115681"/>
+      <w:bookmarkStart w:id="4" w:name="_Toc244116214"/>
       <w:r>
         <w:t>Modelo seleccionado: híbrido Scrum + DevOps</w:t>
       </w:r>
@@ -4534,7 +4534,7 @@
       <w:pPr>
         <w:pStyle w:val="Ttulo2"/>
       </w:pPr>
-      <w:bookmarkStart w:id="5" w:name="_Toc244115682"/>
+      <w:bookmarkStart w:id="5" w:name="_Toc244116215"/>
       <w:r>
         <w:t>Fases del ciclo de vida en el proyecto</w:t>
       </w:r>
@@ -5042,7 +5042,7 @@
       <w:pPr>
         <w:pStyle w:val="Ttulo1"/>
       </w:pPr>
-      <w:bookmarkStart w:id="6" w:name="_Toc244115683"/>
+      <w:bookmarkStart w:id="6" w:name="_Toc244116216"/>
       <w:r>
         <w:t>Roles del equipo</w:t>
       </w:r>
@@ -5774,7 +5774,7 @@
       <w:pPr>
         <w:pStyle w:val="Ttulo2"/>
       </w:pPr>
-      <w:bookmarkStart w:id="7" w:name="_Toc244115684"/>
+      <w:bookmarkStart w:id="7" w:name="_Toc244116217"/>
       <w:r>
         <w:lastRenderedPageBreak/>
         <w:t>Matriz de responsabilidades (RACI)</w:t>
@@ -8266,7 +8266,7 @@
       <w:pPr>
         <w:pStyle w:val="Ttulo1"/>
       </w:pPr>
-      <w:bookmarkStart w:id="8" w:name="_Toc244115685"/>
+      <w:bookmarkStart w:id="8" w:name="_Toc244116218"/>
       <w:r>
         <w:t>Requerimientos del sistema</w:t>
       </w:r>
@@ -8284,7 +8284,7 @@
       <w:pPr>
         <w:pStyle w:val="Ttulo2"/>
       </w:pPr>
-      <w:bookmarkStart w:id="9" w:name="_Toc244115686"/>
+      <w:bookmarkStart w:id="9" w:name="_Toc244116219"/>
       <w:r>
         <w:lastRenderedPageBreak/>
         <w:t>Estándares aplicados</w:t>
@@ -8737,7 +8737,7 @@
       <w:pPr>
         <w:pStyle w:val="Ttulo2"/>
       </w:pPr>
-      <w:bookmarkStart w:id="10" w:name="_Toc244115687"/>
+      <w:bookmarkStart w:id="10" w:name="_Toc244116220"/>
       <w:r>
         <w:t>Actores del sistema</w:t>
       </w:r>
@@ -8803,7 +8803,7 @@
       <w:pPr>
         <w:pStyle w:val="Ttulo2"/>
       </w:pPr>
-      <w:bookmarkStart w:id="11" w:name="_Toc244115688"/>
+      <w:bookmarkStart w:id="11" w:name="_Toc244116221"/>
       <w:r>
         <w:lastRenderedPageBreak/>
         <w:t>Requerimientos del negocio</w:t>
@@ -9908,7 +9908,7 @@
       <w:pPr>
         <w:pStyle w:val="Ttulo2"/>
       </w:pPr>
-      <w:bookmarkStart w:id="12" w:name="_Toc244115689"/>
+      <w:bookmarkStart w:id="12" w:name="_Toc244116222"/>
       <w:r>
         <w:t>Requerimientos funcionales</w:t>
       </w:r>
@@ -13212,7 +13212,7 @@
       <w:pPr>
         <w:pStyle w:val="Ttulo2"/>
       </w:pPr>
-      <w:bookmarkStart w:id="13" w:name="_Toc244115690"/>
+      <w:bookmarkStart w:id="13" w:name="_Toc244116223"/>
       <w:r>
         <w:t>Requerimientos no funcionales</w:t>
       </w:r>
@@ -15079,7 +15079,7 @@
       <w:pPr>
         <w:pStyle w:val="Ttulo2"/>
       </w:pPr>
-      <w:bookmarkStart w:id="14" w:name="_Toc244115691"/>
+      <w:bookmarkStart w:id="14" w:name="_Toc244116224"/>
       <w:r>
         <w:t>Épicas e historias de usuario</w:t>
       </w:r>
@@ -15965,7 +15965,7 @@
       <w:pPr>
         <w:pStyle w:val="Ttulo2"/>
       </w:pPr>
-      <w:bookmarkStart w:id="15" w:name="_Toc244115692"/>
+      <w:bookmarkStart w:id="15" w:name="_Toc244116225"/>
       <w:r>
         <w:t>Validación de los requisitos</w:t>
       </w:r>
@@ -15983,7 +15983,7 @@
       <w:pPr>
         <w:pStyle w:val="Ttulo1"/>
       </w:pPr>
-      <w:bookmarkStart w:id="16" w:name="_Toc244115693"/>
+      <w:bookmarkStart w:id="16" w:name="_Toc244116226"/>
       <w:r>
         <w:t>Metodología y plan de ejecución</w:t>
       </w:r>
@@ -15993,7 +15993,7 @@
       <w:pPr>
         <w:pStyle w:val="Ttulo2"/>
       </w:pPr>
-      <w:bookmarkStart w:id="17" w:name="_Toc244115694"/>
+      <w:bookmarkStart w:id="17" w:name="_Toc244116227"/>
       <w:r>
         <w:t>Metodología: Scrum con prácticas DevOps</w:t>
       </w:r>
@@ -16553,7 +16553,7 @@
       <w:pPr>
         <w:pStyle w:val="Ttulo2"/>
       </w:pPr>
-      <w:bookmarkStart w:id="18" w:name="_Toc244115695"/>
+      <w:bookmarkStart w:id="18" w:name="_Toc244116228"/>
       <w:r>
         <w:t>Plan de sprints</w:t>
       </w:r>
@@ -17126,7 +17126,7 @@
       <w:pPr>
         <w:pStyle w:val="Ttulo2"/>
       </w:pPr>
-      <w:bookmarkStart w:id="19" w:name="_Toc244115696"/>
+      <w:bookmarkStart w:id="19" w:name="_Toc244116229"/>
       <w:r>
         <w:lastRenderedPageBreak/>
         <w:t>Asignación de trabajo por rol</w:t>
@@ -17841,7 +17841,7 @@
       <w:pPr>
         <w:pStyle w:val="Ttulo2"/>
       </w:pPr>
-      <w:bookmarkStart w:id="20" w:name="_Toc244115697"/>
+      <w:bookmarkStart w:id="20" w:name="_Toc244116230"/>
       <w:r>
         <w:t>Riesgos</w:t>
       </w:r>
@@ -18399,7 +18399,7 @@
       <w:pPr>
         <w:pStyle w:val="Ttulo2"/>
       </w:pPr>
-      <w:bookmarkStart w:id="21" w:name="_Toc244115698"/>
+      <w:bookmarkStart w:id="21" w:name="_Toc244116231"/>
       <w:r>
         <w:lastRenderedPageBreak/>
         <w:t>Herramientas</w:t>
@@ -18466,7 +18466,7 @@
       <w:pPr>
         <w:pStyle w:val="Ttulo1"/>
       </w:pPr>
-      <w:bookmarkStart w:id="22" w:name="_Toc244115699"/>
+      <w:bookmarkStart w:id="22" w:name="_Toc244116232"/>
       <w:r>
         <w:t>Conclusiones</w:t>
       </w:r>
@@ -18496,7 +18496,7 @@
       <w:pPr>
         <w:pStyle w:val="Ttulo1"/>
       </w:pPr>
-      <w:bookmarkStart w:id="23" w:name="_Toc244115700"/>
+      <w:bookmarkStart w:id="23" w:name="_Toc244116233"/>
       <w:r>
         <w:lastRenderedPageBreak/>
         <w:t>Referencias</w:t>
@@ -18952,31 +18952,31 @@
       </w:rPr>
     </w:lvl>
   </w:abstractNum>
-  <w:num w:numId="1" w16cid:durableId="474179129">
+  <w:num w:numId="1" w16cid:durableId="2026780512">
     <w:abstractNumId w:val="8"/>
   </w:num>
-  <w:num w:numId="2" w16cid:durableId="448087761">
+  <w:num w:numId="2" w16cid:durableId="10188833">
     <w:abstractNumId w:val="6"/>
   </w:num>
-  <w:num w:numId="3" w16cid:durableId="1469011470">
+  <w:num w:numId="3" w16cid:durableId="728698677">
     <w:abstractNumId w:val="5"/>
   </w:num>
-  <w:num w:numId="4" w16cid:durableId="718675851">
+  <w:num w:numId="4" w16cid:durableId="1223447155">
     <w:abstractNumId w:val="4"/>
   </w:num>
-  <w:num w:numId="5" w16cid:durableId="840512774">
+  <w:num w:numId="5" w16cid:durableId="1874881886">
     <w:abstractNumId w:val="7"/>
   </w:num>
-  <w:num w:numId="6" w16cid:durableId="1681202503">
+  <w:num w:numId="6" w16cid:durableId="1676759824">
     <w:abstractNumId w:val="3"/>
   </w:num>
-  <w:num w:numId="7" w16cid:durableId="155191139">
+  <w:num w:numId="7" w16cid:durableId="1050574819">
     <w:abstractNumId w:val="2"/>
   </w:num>
-  <w:num w:numId="8" w16cid:durableId="619848425">
+  <w:num w:numId="8" w16cid:durableId="388307093">
     <w:abstractNumId w:val="1"/>
   </w:num>
-  <w:num w:numId="9" w16cid:durableId="1352685565">
+  <w:num w:numId="9" w16cid:durableId="1133712295">
     <w:abstractNumId w:val="0"/>
   </w:num>
 </w:numbering>
@@ -30396,7 +30396,7 @@
     <w:autoRedefine/>
     <w:uiPriority w:val="39"/>
     <w:unhideWhenUsed/>
-    <w:rsid w:val="00362556"/>
+    <w:rsid w:val="00B91B1A"/>
     <w:pPr>
       <w:spacing w:after="100"/>
     </w:pPr>
@@ -30408,7 +30408,7 @@
     <w:autoRedefine/>
     <w:uiPriority w:val="39"/>
     <w:unhideWhenUsed/>
-    <w:rsid w:val="00362556"/>
+    <w:rsid w:val="00B91B1A"/>
     <w:pPr>
       <w:spacing w:after="100"/>
       <w:ind w:left="240"/>
@@ -30419,7 +30419,7 @@
     <w:basedOn w:val="Fuentedeprrafopredeter"/>
     <w:uiPriority w:val="99"/>
     <w:unhideWhenUsed/>
-    <w:rsid w:val="00362556"/>
+    <w:rsid w:val="00B91B1A"/>
     <w:rPr>
       <w:color w:val="0000FF" w:themeColor="hyperlink"/>
       <w:u w:val="single"/>

</xml_diff>

<commit_message>
Corregir facultad en la portada del plan de proyecto
Co-Authored-By: Claude Opus 5.5 (1M context) <noreply@anthropic.com>
</commit_message>
<xml_diff>
--- a/docs/planificacion/Plan-de-proyecto-QuienLoTiene.docx
+++ b/docs/planificacion/Plan-de-proyecto-QuienLoTiene.docx
@@ -12,7 +12,7 @@
           <w:noProof/>
         </w:rPr>
         <w:drawing>
-          <wp:inline distT="0" distB="0" distL="0" distR="0" wp14:anchorId="729D24DA" wp14:editId="119BC4F2">
+          <wp:inline distT="0" distB="0" distL="0" distR="0" wp14:anchorId="3CE441F4" wp14:editId="1BC30C0E">
             <wp:extent cx="1737360" cy="1737360"/>
             <wp:effectExtent l="0" t="0" r="0" b="0"/>
             <wp:docPr id="1" name="Picture 1"/>
@@ -169,7 +169,7 @@
         <w:jc w:val="center"/>
       </w:pPr>
       <w:r>
-        <w:t>Facultad de Ingeniería</w:t>
+        <w:t>Facultad de Ingeniería de Sistemas</w:t>
       </w:r>
     </w:p>
     <w:p>
@@ -242,7 +242,7 @@
       <w:r>
         <w:fldChar w:fldCharType="separate"/>
       </w:r>
-      <w:hyperlink w:anchor="_Toc244116210" w:history="1">
+      <w:hyperlink w:anchor="_Toc244116322" w:history="1">
         <w:r>
           <w:rPr>
             <w:rStyle w:val="Hipervnculo"/>
@@ -269,7 +269,7 @@
             <w:noProof/>
             <w:webHidden/>
           </w:rPr>
-          <w:instrText xml:space="preserve"> PAGEREF _Toc244116210 \h </w:instrText>
+          <w:instrText xml:space="preserve"> PAGEREF _Toc244116322 \h </w:instrText>
         </w:r>
         <w:r>
           <w:rPr>
@@ -316,7 +316,7 @@
           <w14:ligatures w14:val="standardContextual"/>
         </w:rPr>
       </w:pPr>
-      <w:hyperlink w:anchor="_Toc244116211" w:history="1">
+      <w:hyperlink w:anchor="_Toc244116323" w:history="1">
         <w:r>
           <w:rPr>
             <w:rStyle w:val="Hipervnculo"/>
@@ -343,7 +343,7 @@
             <w:noProof/>
             <w:webHidden/>
           </w:rPr>
-          <w:instrText xml:space="preserve"> PAGEREF _Toc244116211 \h </w:instrText>
+          <w:instrText xml:space="preserve"> PAGEREF _Toc244116323 \h </w:instrText>
         </w:r>
         <w:r>
           <w:rPr>
@@ -390,7 +390,7 @@
           <w14:ligatures w14:val="standardContextual"/>
         </w:rPr>
       </w:pPr>
-      <w:hyperlink w:anchor="_Toc244116212" w:history="1">
+      <w:hyperlink w:anchor="_Toc244116324" w:history="1">
         <w:r>
           <w:rPr>
             <w:rStyle w:val="Hipervnculo"/>
@@ -417,7 +417,7 @@
             <w:noProof/>
             <w:webHidden/>
           </w:rPr>
-          <w:instrText xml:space="preserve"> PAGEREF _Toc244116212 \h </w:instrText>
+          <w:instrText xml:space="preserve"> PAGEREF _Toc244116324 \h </w:instrText>
         </w:r>
         <w:r>
           <w:rPr>
@@ -464,7 +464,7 @@
           <w14:ligatures w14:val="standardContextual"/>
         </w:rPr>
       </w:pPr>
-      <w:hyperlink w:anchor="_Toc244116213" w:history="1">
+      <w:hyperlink w:anchor="_Toc244116325" w:history="1">
         <w:r>
           <w:rPr>
             <w:rStyle w:val="Hipervnculo"/>
@@ -491,7 +491,7 @@
             <w:noProof/>
             <w:webHidden/>
           </w:rPr>
-          <w:instrText xml:space="preserve"> PAGEREF _Toc244116213 \h </w:instrText>
+          <w:instrText xml:space="preserve"> PAGEREF _Toc244116325 \h </w:instrText>
         </w:r>
         <w:r>
           <w:rPr>
@@ -538,7 +538,7 @@
           <w14:ligatures w14:val="standardContextual"/>
         </w:rPr>
       </w:pPr>
-      <w:hyperlink w:anchor="_Toc244116214" w:history="1">
+      <w:hyperlink w:anchor="_Toc244116326" w:history="1">
         <w:r>
           <w:rPr>
             <w:rStyle w:val="Hipervnculo"/>
@@ -565,7 +565,7 @@
             <w:noProof/>
             <w:webHidden/>
           </w:rPr>
-          <w:instrText xml:space="preserve"> PAGEREF _Toc244116214 \h </w:instrText>
+          <w:instrText xml:space="preserve"> PAGEREF _Toc244116326 \h </w:instrText>
         </w:r>
         <w:r>
           <w:rPr>
@@ -612,7 +612,7 @@
           <w14:ligatures w14:val="standardContextual"/>
         </w:rPr>
       </w:pPr>
-      <w:hyperlink w:anchor="_Toc244116215" w:history="1">
+      <w:hyperlink w:anchor="_Toc244116327" w:history="1">
         <w:r>
           <w:rPr>
             <w:rStyle w:val="Hipervnculo"/>
@@ -639,7 +639,7 @@
             <w:noProof/>
             <w:webHidden/>
           </w:rPr>
-          <w:instrText xml:space="preserve"> PAGEREF _Toc244116215 \h </w:instrText>
+          <w:instrText xml:space="preserve"> PAGEREF _Toc244116327 \h </w:instrText>
         </w:r>
         <w:r>
           <w:rPr>
@@ -686,7 +686,7 @@
           <w14:ligatures w14:val="standardContextual"/>
         </w:rPr>
       </w:pPr>
-      <w:hyperlink w:anchor="_Toc244116216" w:history="1">
+      <w:hyperlink w:anchor="_Toc244116328" w:history="1">
         <w:r>
           <w:rPr>
             <w:rStyle w:val="Hipervnculo"/>
@@ -713,7 +713,7 @@
             <w:noProof/>
             <w:webHidden/>
           </w:rPr>
-          <w:instrText xml:space="preserve"> PAGEREF _Toc244116216 \h </w:instrText>
+          <w:instrText xml:space="preserve"> PAGEREF _Toc244116328 \h </w:instrText>
         </w:r>
         <w:r>
           <w:rPr>
@@ -760,7 +760,7 @@
           <w14:ligatures w14:val="standardContextual"/>
         </w:rPr>
       </w:pPr>
-      <w:hyperlink w:anchor="_Toc244116217" w:history="1">
+      <w:hyperlink w:anchor="_Toc244116329" w:history="1">
         <w:r>
           <w:rPr>
             <w:rStyle w:val="Hipervnculo"/>
@@ -787,7 +787,7 @@
             <w:noProof/>
             <w:webHidden/>
           </w:rPr>
-          <w:instrText xml:space="preserve"> PAGEREF _Toc244116217 \h </w:instrText>
+          <w:instrText xml:space="preserve"> PAGEREF _Toc244116329 \h </w:instrText>
         </w:r>
         <w:r>
           <w:rPr>
@@ -834,7 +834,7 @@
           <w14:ligatures w14:val="standardContextual"/>
         </w:rPr>
       </w:pPr>
-      <w:hyperlink w:anchor="_Toc244116218" w:history="1">
+      <w:hyperlink w:anchor="_Toc244116330" w:history="1">
         <w:r>
           <w:rPr>
             <w:rStyle w:val="Hipervnculo"/>
@@ -861,7 +861,7 @@
             <w:noProof/>
             <w:webHidden/>
           </w:rPr>
-          <w:instrText xml:space="preserve"> PAGEREF _Toc244116218 \h </w:instrText>
+          <w:instrText xml:space="preserve"> PAGEREF _Toc244116330 \h </w:instrText>
         </w:r>
         <w:r>
           <w:rPr>
@@ -908,7 +908,7 @@
           <w14:ligatures w14:val="standardContextual"/>
         </w:rPr>
       </w:pPr>
-      <w:hyperlink w:anchor="_Toc244116219" w:history="1">
+      <w:hyperlink w:anchor="_Toc244116331" w:history="1">
         <w:r>
           <w:rPr>
             <w:rStyle w:val="Hipervnculo"/>
@@ -935,7 +935,7 @@
             <w:noProof/>
             <w:webHidden/>
           </w:rPr>
-          <w:instrText xml:space="preserve"> PAGEREF _Toc244116219 \h </w:instrText>
+          <w:instrText xml:space="preserve"> PAGEREF _Toc244116331 \h </w:instrText>
         </w:r>
         <w:r>
           <w:rPr>
@@ -982,7 +982,7 @@
           <w14:ligatures w14:val="standardContextual"/>
         </w:rPr>
       </w:pPr>
-      <w:hyperlink w:anchor="_Toc244116220" w:history="1">
+      <w:hyperlink w:anchor="_Toc244116332" w:history="1">
         <w:r>
           <w:rPr>
             <w:rStyle w:val="Hipervnculo"/>
@@ -1009,7 +1009,7 @@
             <w:noProof/>
             <w:webHidden/>
           </w:rPr>
-          <w:instrText xml:space="preserve"> PAGEREF _Toc244116220 \h </w:instrText>
+          <w:instrText xml:space="preserve"> PAGEREF _Toc244116332 \h </w:instrText>
         </w:r>
         <w:r>
           <w:rPr>
@@ -1056,7 +1056,7 @@
           <w14:ligatures w14:val="standardContextual"/>
         </w:rPr>
       </w:pPr>
-      <w:hyperlink w:anchor="_Toc244116221" w:history="1">
+      <w:hyperlink w:anchor="_Toc244116333" w:history="1">
         <w:r>
           <w:rPr>
             <w:rStyle w:val="Hipervnculo"/>
@@ -1083,7 +1083,7 @@
             <w:noProof/>
             <w:webHidden/>
           </w:rPr>
-          <w:instrText xml:space="preserve"> PAGEREF _Toc244116221 \h </w:instrText>
+          <w:instrText xml:space="preserve"> PAGEREF _Toc244116333 \h </w:instrText>
         </w:r>
         <w:r>
           <w:rPr>
@@ -1130,7 +1130,7 @@
           <w14:ligatures w14:val="standardContextual"/>
         </w:rPr>
       </w:pPr>
-      <w:hyperlink w:anchor="_Toc244116222" w:history="1">
+      <w:hyperlink w:anchor="_Toc244116334" w:history="1">
         <w:r>
           <w:rPr>
             <w:rStyle w:val="Hipervnculo"/>
@@ -1157,7 +1157,7 @@
             <w:noProof/>
             <w:webHidden/>
           </w:rPr>
-          <w:instrText xml:space="preserve"> PAGEREF _Toc244116222 \h </w:instrText>
+          <w:instrText xml:space="preserve"> PAGEREF _Toc244116334 \h </w:instrText>
         </w:r>
         <w:r>
           <w:rPr>
@@ -1204,7 +1204,7 @@
           <w14:ligatures w14:val="standardContextual"/>
         </w:rPr>
       </w:pPr>
-      <w:hyperlink w:anchor="_Toc244116223" w:history="1">
+      <w:hyperlink w:anchor="_Toc244116335" w:history="1">
         <w:r>
           <w:rPr>
             <w:rStyle w:val="Hipervnculo"/>
@@ -1231,7 +1231,7 @@
             <w:noProof/>
             <w:webHidden/>
           </w:rPr>
-          <w:instrText xml:space="preserve"> PAGEREF _Toc244116223 \h </w:instrText>
+          <w:instrText xml:space="preserve"> PAGEREF _Toc244116335 \h </w:instrText>
         </w:r>
         <w:r>
           <w:rPr>
@@ -1278,7 +1278,7 @@
           <w14:ligatures w14:val="standardContextual"/>
         </w:rPr>
       </w:pPr>
-      <w:hyperlink w:anchor="_Toc244116224" w:history="1">
+      <w:hyperlink w:anchor="_Toc244116336" w:history="1">
         <w:r>
           <w:rPr>
             <w:rStyle w:val="Hipervnculo"/>
@@ -1305,7 +1305,7 @@
             <w:noProof/>
             <w:webHidden/>
           </w:rPr>
-          <w:instrText xml:space="preserve"> PAGEREF _Toc244116224 \h </w:instrText>
+          <w:instrText xml:space="preserve"> PAGEREF _Toc244116336 \h </w:instrText>
         </w:r>
         <w:r>
           <w:rPr>
@@ -1352,7 +1352,7 @@
           <w14:ligatures w14:val="standardContextual"/>
         </w:rPr>
       </w:pPr>
-      <w:hyperlink w:anchor="_Toc244116225" w:history="1">
+      <w:hyperlink w:anchor="_Toc244116337" w:history="1">
         <w:r>
           <w:rPr>
             <w:rStyle w:val="Hipervnculo"/>
@@ -1379,7 +1379,7 @@
             <w:noProof/>
             <w:webHidden/>
           </w:rPr>
-          <w:instrText xml:space="preserve"> PAGEREF _Toc244116225 \h </w:instrText>
+          <w:instrText xml:space="preserve"> PAGEREF _Toc244116337 \h </w:instrText>
         </w:r>
         <w:r>
           <w:rPr>
@@ -1426,7 +1426,7 @@
           <w14:ligatures w14:val="standardContextual"/>
         </w:rPr>
       </w:pPr>
-      <w:hyperlink w:anchor="_Toc244116226" w:history="1">
+      <w:hyperlink w:anchor="_Toc244116338" w:history="1">
         <w:r>
           <w:rPr>
             <w:rStyle w:val="Hipervnculo"/>
@@ -1453,7 +1453,7 @@
             <w:noProof/>
             <w:webHidden/>
           </w:rPr>
-          <w:instrText xml:space="preserve"> PAGEREF _Toc244116226 \h </w:instrText>
+          <w:instrText xml:space="preserve"> PAGEREF _Toc244116338 \h </w:instrText>
         </w:r>
         <w:r>
           <w:rPr>
@@ -1500,7 +1500,7 @@
           <w14:ligatures w14:val="standardContextual"/>
         </w:rPr>
       </w:pPr>
-      <w:hyperlink w:anchor="_Toc244116227" w:history="1">
+      <w:hyperlink w:anchor="_Toc244116339" w:history="1">
         <w:r>
           <w:rPr>
             <w:rStyle w:val="Hipervnculo"/>
@@ -1527,7 +1527,7 @@
             <w:noProof/>
             <w:webHidden/>
           </w:rPr>
-          <w:instrText xml:space="preserve"> PAGEREF _Toc244116227 \h </w:instrText>
+          <w:instrText xml:space="preserve"> PAGEREF _Toc244116339 \h </w:instrText>
         </w:r>
         <w:r>
           <w:rPr>
@@ -1574,7 +1574,7 @@
           <w14:ligatures w14:val="standardContextual"/>
         </w:rPr>
       </w:pPr>
-      <w:hyperlink w:anchor="_Toc244116228" w:history="1">
+      <w:hyperlink w:anchor="_Toc244116340" w:history="1">
         <w:r>
           <w:rPr>
             <w:rStyle w:val="Hipervnculo"/>
@@ -1601,7 +1601,7 @@
             <w:noProof/>
             <w:webHidden/>
           </w:rPr>
-          <w:instrText xml:space="preserve"> PAGEREF _Toc244116228 \h </w:instrText>
+          <w:instrText xml:space="preserve"> PAGEREF _Toc244116340 \h </w:instrText>
         </w:r>
         <w:r>
           <w:rPr>
@@ -1648,7 +1648,7 @@
           <w14:ligatures w14:val="standardContextual"/>
         </w:rPr>
       </w:pPr>
-      <w:hyperlink w:anchor="_Toc244116229" w:history="1">
+      <w:hyperlink w:anchor="_Toc244116341" w:history="1">
         <w:r>
           <w:rPr>
             <w:rStyle w:val="Hipervnculo"/>
@@ -1675,7 +1675,7 @@
             <w:noProof/>
             <w:webHidden/>
           </w:rPr>
-          <w:instrText xml:space="preserve"> PAGEREF _Toc244116229 \h </w:instrText>
+          <w:instrText xml:space="preserve"> PAGEREF _Toc244116341 \h </w:instrText>
         </w:r>
         <w:r>
           <w:rPr>
@@ -1722,7 +1722,7 @@
           <w14:ligatures w14:val="standardContextual"/>
         </w:rPr>
       </w:pPr>
-      <w:hyperlink w:anchor="_Toc244116230" w:history="1">
+      <w:hyperlink w:anchor="_Toc244116342" w:history="1">
         <w:r>
           <w:rPr>
             <w:rStyle w:val="Hipervnculo"/>
@@ -1749,7 +1749,7 @@
             <w:noProof/>
             <w:webHidden/>
           </w:rPr>
-          <w:instrText xml:space="preserve"> PAGEREF _Toc244116230 \h </w:instrText>
+          <w:instrText xml:space="preserve"> PAGEREF _Toc244116342 \h </w:instrText>
         </w:r>
         <w:r>
           <w:rPr>
@@ -1796,7 +1796,7 @@
           <w14:ligatures w14:val="standardContextual"/>
         </w:rPr>
       </w:pPr>
-      <w:hyperlink w:anchor="_Toc244116231" w:history="1">
+      <w:hyperlink w:anchor="_Toc244116343" w:history="1">
         <w:r>
           <w:rPr>
             <w:rStyle w:val="Hipervnculo"/>
@@ -1823,7 +1823,7 @@
             <w:noProof/>
             <w:webHidden/>
           </w:rPr>
-          <w:instrText xml:space="preserve"> PAGEREF _Toc244116231 \h </w:instrText>
+          <w:instrText xml:space="preserve"> PAGEREF _Toc244116343 \h </w:instrText>
         </w:r>
         <w:r>
           <w:rPr>
@@ -1870,7 +1870,7 @@
           <w14:ligatures w14:val="standardContextual"/>
         </w:rPr>
       </w:pPr>
-      <w:hyperlink w:anchor="_Toc244116232" w:history="1">
+      <w:hyperlink w:anchor="_Toc244116344" w:history="1">
         <w:r>
           <w:rPr>
             <w:rStyle w:val="Hipervnculo"/>
@@ -1897,7 +1897,7 @@
             <w:noProof/>
             <w:webHidden/>
           </w:rPr>
-          <w:instrText xml:space="preserve"> PAGEREF _Toc244116232 \h </w:instrText>
+          <w:instrText xml:space="preserve"> PAGEREF _Toc244116344 \h </w:instrText>
         </w:r>
         <w:r>
           <w:rPr>
@@ -1944,7 +1944,7 @@
           <w14:ligatures w14:val="standardContextual"/>
         </w:rPr>
       </w:pPr>
-      <w:hyperlink w:anchor="_Toc244116233" w:history="1">
+      <w:hyperlink w:anchor="_Toc244116345" w:history="1">
         <w:r>
           <w:rPr>
             <w:rStyle w:val="Hipervnculo"/>
@@ -1971,7 +1971,7 @@
             <w:noProof/>
             <w:webHidden/>
           </w:rPr>
-          <w:instrText xml:space="preserve"> PAGEREF _Toc244116233 \h </w:instrText>
+          <w:instrText xml:space="preserve"> PAGEREF _Toc244116345 \h </w:instrText>
         </w:r>
         <w:r>
           <w:rPr>
@@ -2019,7 +2019,7 @@
       <w:pPr>
         <w:pStyle w:val="Ttulo1"/>
       </w:pPr>
-      <w:bookmarkStart w:id="0" w:name="_Toc244116210"/>
+      <w:bookmarkStart w:id="0" w:name="_Toc244116322"/>
       <w:r>
         <w:lastRenderedPageBreak/>
         <w:t>Introducción</w:t>
@@ -2048,7 +2048,7 @@
       <w:pPr>
         <w:pStyle w:val="Ttulo2"/>
       </w:pPr>
-      <w:bookmarkStart w:id="1" w:name="_Toc244116211"/>
+      <w:bookmarkStart w:id="1" w:name="_Toc244116323"/>
       <w:r>
         <w:lastRenderedPageBreak/>
         <w:t>Objetivos</w:t>
@@ -2112,7 +2112,7 @@
       <w:pPr>
         <w:pStyle w:val="Ttulo1"/>
       </w:pPr>
-      <w:bookmarkStart w:id="2" w:name="_Toc244116212"/>
+      <w:bookmarkStart w:id="2" w:name="_Toc244116324"/>
       <w:r>
         <w:t>Ciclo de vida del software</w:t>
       </w:r>
@@ -2127,7 +2127,7 @@
       <w:pPr>
         <w:pStyle w:val="Ttulo2"/>
       </w:pPr>
-      <w:bookmarkStart w:id="3" w:name="_Toc244116213"/>
+      <w:bookmarkStart w:id="3" w:name="_Toc244116325"/>
       <w:r>
         <w:t>Criterios de selección</w:t>
       </w:r>
@@ -4429,7 +4429,7 @@
       <w:pPr>
         <w:pStyle w:val="Ttulo2"/>
       </w:pPr>
-      <w:bookmarkStart w:id="4" w:name="_Toc244116214"/>
+      <w:bookmarkStart w:id="4" w:name="_Toc244116326"/>
       <w:r>
         <w:t>Modelo seleccionado: híbrido Scrum + DevOps</w:t>
       </w:r>
@@ -4534,7 +4534,7 @@
       <w:pPr>
         <w:pStyle w:val="Ttulo2"/>
       </w:pPr>
-      <w:bookmarkStart w:id="5" w:name="_Toc244116215"/>
+      <w:bookmarkStart w:id="5" w:name="_Toc244116327"/>
       <w:r>
         <w:t>Fases del ciclo de vida en el proyecto</w:t>
       </w:r>
@@ -5042,7 +5042,7 @@
       <w:pPr>
         <w:pStyle w:val="Ttulo1"/>
       </w:pPr>
-      <w:bookmarkStart w:id="6" w:name="_Toc244116216"/>
+      <w:bookmarkStart w:id="6" w:name="_Toc244116328"/>
       <w:r>
         <w:t>Roles del equipo</w:t>
       </w:r>
@@ -5774,7 +5774,7 @@
       <w:pPr>
         <w:pStyle w:val="Ttulo2"/>
       </w:pPr>
-      <w:bookmarkStart w:id="7" w:name="_Toc244116217"/>
+      <w:bookmarkStart w:id="7" w:name="_Toc244116329"/>
       <w:r>
         <w:lastRenderedPageBreak/>
         <w:t>Matriz de responsabilidades (RACI)</w:t>
@@ -8266,7 +8266,7 @@
       <w:pPr>
         <w:pStyle w:val="Ttulo1"/>
       </w:pPr>
-      <w:bookmarkStart w:id="8" w:name="_Toc244116218"/>
+      <w:bookmarkStart w:id="8" w:name="_Toc244116330"/>
       <w:r>
         <w:t>Requerimientos del sistema</w:t>
       </w:r>
@@ -8284,7 +8284,7 @@
       <w:pPr>
         <w:pStyle w:val="Ttulo2"/>
       </w:pPr>
-      <w:bookmarkStart w:id="9" w:name="_Toc244116219"/>
+      <w:bookmarkStart w:id="9" w:name="_Toc244116331"/>
       <w:r>
         <w:lastRenderedPageBreak/>
         <w:t>Estándares aplicados</w:t>
@@ -8737,7 +8737,7 @@
       <w:pPr>
         <w:pStyle w:val="Ttulo2"/>
       </w:pPr>
-      <w:bookmarkStart w:id="10" w:name="_Toc244116220"/>
+      <w:bookmarkStart w:id="10" w:name="_Toc244116332"/>
       <w:r>
         <w:t>Actores del sistema</w:t>
       </w:r>
@@ -8803,7 +8803,7 @@
       <w:pPr>
         <w:pStyle w:val="Ttulo2"/>
       </w:pPr>
-      <w:bookmarkStart w:id="11" w:name="_Toc244116221"/>
+      <w:bookmarkStart w:id="11" w:name="_Toc244116333"/>
       <w:r>
         <w:lastRenderedPageBreak/>
         <w:t>Requerimientos del negocio</w:t>
@@ -9908,7 +9908,7 @@
       <w:pPr>
         <w:pStyle w:val="Ttulo2"/>
       </w:pPr>
-      <w:bookmarkStart w:id="12" w:name="_Toc244116222"/>
+      <w:bookmarkStart w:id="12" w:name="_Toc244116334"/>
       <w:r>
         <w:t>Requerimientos funcionales</w:t>
       </w:r>
@@ -13212,7 +13212,7 @@
       <w:pPr>
         <w:pStyle w:val="Ttulo2"/>
       </w:pPr>
-      <w:bookmarkStart w:id="13" w:name="_Toc244116223"/>
+      <w:bookmarkStart w:id="13" w:name="_Toc244116335"/>
       <w:r>
         <w:t>Requerimientos no funcionales</w:t>
       </w:r>
@@ -15079,7 +15079,7 @@
       <w:pPr>
         <w:pStyle w:val="Ttulo2"/>
       </w:pPr>
-      <w:bookmarkStart w:id="14" w:name="_Toc244116224"/>
+      <w:bookmarkStart w:id="14" w:name="_Toc244116336"/>
       <w:r>
         <w:t>Épicas e historias de usuario</w:t>
       </w:r>
@@ -15965,7 +15965,7 @@
       <w:pPr>
         <w:pStyle w:val="Ttulo2"/>
       </w:pPr>
-      <w:bookmarkStart w:id="15" w:name="_Toc244116225"/>
+      <w:bookmarkStart w:id="15" w:name="_Toc244116337"/>
       <w:r>
         <w:t>Validación de los requisitos</w:t>
       </w:r>
@@ -15983,7 +15983,7 @@
       <w:pPr>
         <w:pStyle w:val="Ttulo1"/>
       </w:pPr>
-      <w:bookmarkStart w:id="16" w:name="_Toc244116226"/>
+      <w:bookmarkStart w:id="16" w:name="_Toc244116338"/>
       <w:r>
         <w:t>Metodología y plan de ejecución</w:t>
       </w:r>
@@ -15993,7 +15993,7 @@
       <w:pPr>
         <w:pStyle w:val="Ttulo2"/>
       </w:pPr>
-      <w:bookmarkStart w:id="17" w:name="_Toc244116227"/>
+      <w:bookmarkStart w:id="17" w:name="_Toc244116339"/>
       <w:r>
         <w:t>Metodología: Scrum con prácticas DevOps</w:t>
       </w:r>
@@ -16553,7 +16553,7 @@
       <w:pPr>
         <w:pStyle w:val="Ttulo2"/>
       </w:pPr>
-      <w:bookmarkStart w:id="18" w:name="_Toc244116228"/>
+      <w:bookmarkStart w:id="18" w:name="_Toc244116340"/>
       <w:r>
         <w:t>Plan de sprints</w:t>
       </w:r>
@@ -17126,7 +17126,7 @@
       <w:pPr>
         <w:pStyle w:val="Ttulo2"/>
       </w:pPr>
-      <w:bookmarkStart w:id="19" w:name="_Toc244116229"/>
+      <w:bookmarkStart w:id="19" w:name="_Toc244116341"/>
       <w:r>
         <w:lastRenderedPageBreak/>
         <w:t>Asignación de trabajo por rol</w:t>
@@ -17841,7 +17841,7 @@
       <w:pPr>
         <w:pStyle w:val="Ttulo2"/>
       </w:pPr>
-      <w:bookmarkStart w:id="20" w:name="_Toc244116230"/>
+      <w:bookmarkStart w:id="20" w:name="_Toc244116342"/>
       <w:r>
         <w:t>Riesgos</w:t>
       </w:r>
@@ -18399,7 +18399,7 @@
       <w:pPr>
         <w:pStyle w:val="Ttulo2"/>
       </w:pPr>
-      <w:bookmarkStart w:id="21" w:name="_Toc244116231"/>
+      <w:bookmarkStart w:id="21" w:name="_Toc244116343"/>
       <w:r>
         <w:lastRenderedPageBreak/>
         <w:t>Herramientas</w:t>
@@ -18466,7 +18466,7 @@
       <w:pPr>
         <w:pStyle w:val="Ttulo1"/>
       </w:pPr>
-      <w:bookmarkStart w:id="22" w:name="_Toc244116232"/>
+      <w:bookmarkStart w:id="22" w:name="_Toc244116344"/>
       <w:r>
         <w:t>Conclusiones</w:t>
       </w:r>
@@ -18496,7 +18496,7 @@
       <w:pPr>
         <w:pStyle w:val="Ttulo1"/>
       </w:pPr>
-      <w:bookmarkStart w:id="23" w:name="_Toc244116233"/>
+      <w:bookmarkStart w:id="23" w:name="_Toc244116345"/>
       <w:r>
         <w:lastRenderedPageBreak/>
         <w:t>Referencias</w:t>
@@ -18952,31 +18952,31 @@
       </w:rPr>
     </w:lvl>
   </w:abstractNum>
-  <w:num w:numId="1" w16cid:durableId="2026780512">
+  <w:num w:numId="1" w16cid:durableId="903376838">
     <w:abstractNumId w:val="8"/>
   </w:num>
-  <w:num w:numId="2" w16cid:durableId="10188833">
+  <w:num w:numId="2" w16cid:durableId="2035571190">
     <w:abstractNumId w:val="6"/>
   </w:num>
-  <w:num w:numId="3" w16cid:durableId="728698677">
+  <w:num w:numId="3" w16cid:durableId="1711801696">
     <w:abstractNumId w:val="5"/>
   </w:num>
-  <w:num w:numId="4" w16cid:durableId="1223447155">
+  <w:num w:numId="4" w16cid:durableId="105776859">
     <w:abstractNumId w:val="4"/>
   </w:num>
-  <w:num w:numId="5" w16cid:durableId="1874881886">
+  <w:num w:numId="5" w16cid:durableId="309096786">
     <w:abstractNumId w:val="7"/>
   </w:num>
-  <w:num w:numId="6" w16cid:durableId="1676759824">
+  <w:num w:numId="6" w16cid:durableId="1827623156">
     <w:abstractNumId w:val="3"/>
   </w:num>
-  <w:num w:numId="7" w16cid:durableId="1050574819">
+  <w:num w:numId="7" w16cid:durableId="336546307">
     <w:abstractNumId w:val="2"/>
   </w:num>
-  <w:num w:numId="8" w16cid:durableId="388307093">
+  <w:num w:numId="8" w16cid:durableId="2039550834">
     <w:abstractNumId w:val="1"/>
   </w:num>
-  <w:num w:numId="9" w16cid:durableId="1133712295">
+  <w:num w:numId="9" w16cid:durableId="1610165764">
     <w:abstractNumId w:val="0"/>
   </w:num>
 </w:numbering>
@@ -30396,7 +30396,7 @@
     <w:autoRedefine/>
     <w:uiPriority w:val="39"/>
     <w:unhideWhenUsed/>
-    <w:rsid w:val="00B91B1A"/>
+    <w:rsid w:val="0037344B"/>
     <w:pPr>
       <w:spacing w:after="100"/>
     </w:pPr>
@@ -30408,7 +30408,7 @@
     <w:autoRedefine/>
     <w:uiPriority w:val="39"/>
     <w:unhideWhenUsed/>
-    <w:rsid w:val="00B91B1A"/>
+    <w:rsid w:val="0037344B"/>
     <w:pPr>
       <w:spacing w:after="100"/>
       <w:ind w:left="240"/>
@@ -30419,7 +30419,7 @@
     <w:basedOn w:val="Fuentedeprrafopredeter"/>
     <w:uiPriority w:val="99"/>
     <w:unhideWhenUsed/>
-    <w:rsid w:val="00B91B1A"/>
+    <w:rsid w:val="0037344B"/>
     <w:rPr>
       <w:color w:val="0000FF" w:themeColor="hyperlink"/>
       <w:u w:val="single"/>

</xml_diff>